<commit_message>
Refine resume: 16yr consistency, grad year, Remote, portfolio link
- Impact bullet now says 16-year-old app, matching the experience section.
- Education shows graduation year (2005).
- Current Logos role tagged Remote.
- Added ryangano.com/resume as a contact link (web + as a clickable link
  in the downloadable docx/pdf).

Regenerated public/Ryan_Gano_Resume.{docx,pdf} with the same edits.

Co-Authored-By: Claude Opus 4.8 <noreply@anthropic.com>
</commit_message>
<xml_diff>
--- a/public/Ryan_Gano_Resume.docx
+++ b/public/Ryan_Gano_Resume.docx
@@ -94,6 +94,17 @@
                   <w:rStyle w:val="Hyperlink"/>
                 </w:rPr>
                 <w:t>https://github.com/ryangano</w:t>
+              </w:r>
+            </w:hyperlink>
+            <w:r>
+              <w:br/>
+            </w:r>
+            <w:hyperlink r:id="rId7" w:history="1">
+              <w:r>
+                <w:rPr>
+                  <w:rStyle w:val="Hyperlink"/>
+                </w:rPr>
+                <w:t>ryangano.com/resume</w:t>
               </w:r>
             </w:hyperlink>
           </w:p>
@@ -263,7 +274,13 @@
               <w:t>ading</w:t>
             </w:r>
             <w:r>
-              <w:t xml:space="preserve"> a team to transition a 15-year-old desktop application to a modern web/mobile architecture, delivering ahead of schedule.</w:t>
+              <w:t xml:space="preserve"> a team to transition a </w:t>
+            </w:r>
+            <w:r>
+              <w:t>16-year-old</w:t>
+            </w:r>
+            <w:r>
+              <w:t xml:space="preserve"> desktop application to a modern web/mobile architecture, delivering ahead of schedule.</w:t>
             </w:r>
           </w:p>
           <w:p>
@@ -679,7 +696,13 @@
               <w:t xml:space="preserve">12/2021 - </w:t>
             </w:r>
             <w:r>
-              <w:t>Present</w:t>
+              <w:t xml:space="preserve">Present </w:t>
+            </w:r>
+            <w:r>
+              <w:t>·</w:t>
+            </w:r>
+            <w:r>
+              <w:t xml:space="preserve"> Remote</w:t>
             </w:r>
             <w:r>
               <w:tab/>
@@ -1486,7 +1509,7 @@
             </w:tcMar>
           </w:tcPr>
           <w:p>
-            <w:hyperlink r:id="rId7">
+            <w:hyperlink r:id="rId8">
               <w:r>
                 <w:rPr>
                   <w:rStyle w:val="Hyperlink"/>
@@ -1505,7 +1528,7 @@
             </w:r>
           </w:p>
           <w:p>
-            <w:hyperlink r:id="rId8">
+            <w:hyperlink r:id="rId9">
               <w:r>
                 <w:rPr>
                   <w:rStyle w:val="Hyperlink"/>
@@ -1533,7 +1556,7 @@
             </w:r>
           </w:p>
           <w:p>
-            <w:hyperlink r:id="rId9">
+            <w:hyperlink r:id="rId10">
               <w:r>
                 <w:rPr>
                   <w:rStyle w:val="Hyperlink"/>
@@ -1614,7 +1637,21 @@
                 <w:b w:val="0"/>
                 <w:bCs w:val="0"/>
               </w:rPr>
-              <w:t>BS in Computer Science</w:t>
+              <w:t xml:space="preserve">BS in Computer Science </w:t>
+            </w:r>
+            <w:r>
+              <w:rPr>
+                <w:b w:val="0"/>
+                <w:bCs w:val="0"/>
+              </w:rPr>
+              <w:t>·</w:t>
+            </w:r>
+            <w:r>
+              <w:rPr>
+                <w:b w:val="0"/>
+                <w:bCs w:val="0"/>
+              </w:rPr>
+              <w:t xml:space="preserve"> 2005</w:t>
             </w:r>
           </w:p>
         </w:tc>
@@ -3126,6 +3163,18 @@
       <w:u w:val="single"/>
     </w:rPr>
   </w:style>
+  <w:style w:type="character" w:styleId="UnresolvedMention">
+    <w:name w:val="Unresolved Mention"/>
+    <w:basedOn w:val="DefaultParagraphFont"/>
+    <w:uiPriority w:val="99"/>
+    <w:semiHidden/>
+    <w:unhideWhenUsed/>
+    <w:rsid w:val="00C25F81"/>
+    <w:rPr>
+      <w:color w:val="605E5C"/>
+      <w:shd w:val="clear" w:color="auto" w:fill="E1DFDD"/>
+    </w:rPr>
+  </w:style>
 </w:styles>
 </file>
 

</xml_diff>